<commit_message>
Align Brief-01 with Trillet content guidelines (§1 playbook)
Audit Brief-01 against the eight-point content playbook in
trillet-ai-content-revamp-brief.md and close the two gaps: intro now
opens with the definition-answer rather than the reader's situation
(guideline #1), and the two required internal links are added -
/whitelabel/pricing and the built-in-compliance blog (guideline #7).
Strengthen the must-includes so real margin %, pricing and named certs
appear in the first screen (guideline #5). Add a guideline-alignment
table mapping all eight points and an explicit note that the target
keywords are inferred from the competitor SERP, not validated against
Trillet's own GSC data (net-new topic).

Co-Authored-By: Claude Opus 4.8 <noreply@anthropic.com>
Claude-Session: https://claude.ai/code/session_01UhVChLeNNjFDr6eASTMGhh
</commit_message>
<xml_diff>
--- a/seo-audit/Brief-01-White-Label-Partnerships-Guide.docx
+++ b/seo-audit/Brief-01-White-Label-Partnerships-Guide.docx
@@ -562,6 +562,19 @@
       <w:r>
         <w:rPr>
           <w:rFonts w:ascii="Calibri" w:cs="Calibri" w:eastAsia="Calibri" w:hAnsi="Calibri"/>
+          <w:b/>
+          <w:bCs/>
+          <w:i w:val="false"/>
+          <w:iCs w:val="false"/>
+          <w:color w:val="24303F"/>
+          <w:sz w:val="19"/>
+          <w:szCs w:val="19"/>
+        </w:rPr>
+        <w:t xml:space="preserve">Guideline #1 — open with the answer, not the pitch. </w:t>
+      </w:r>
+      <w:r>
+        <w:rPr>
+          <w:rFonts w:ascii="Calibri" w:cs="Calibri" w:eastAsia="Calibri" w:hAnsi="Calibri"/>
           <w:b w:val="false"/>
           <w:bCs w:val="false"/>
           <w:i w:val="false"/>
@@ -570,7 +583,7 @@
           <w:sz w:val="19"/>
           <w:szCs w:val="19"/>
         </w:rPr>
-        <w:t xml:space="preserve">Open on the reader’s situation: an agency wants to sell AI without building it. Define the payoff in two lines. State what the guide covers. No throat-clearing.</w:t>
+        <w:t xml:space="preserve">Sentence one must define what a white-label partnership is, in the searcher’s own words — the query is definitional. Then the two-line payoff for an agency (sell AI without building it), then what the guide covers. No throat-clearing, no Trillet pitch yet.</w:t>
       </w:r>
     </w:p>
     <w:p>
@@ -1149,6 +1162,42 @@
           <w:szCs w:val="19"/>
         </w:rPr>
         <w:t xml:space="preserve">— the differentiator. Every competitor omits it.</w:t>
+      </w:r>
+    </w:p>
+    <w:p>
+      <w:pPr>
+        <w:pStyle w:val="ListParagraph"/>
+        <w:numPr>
+          <w:ilvl w:val="0"/>
+          <w:numId w:val="1"/>
+        </w:numPr>
+        <w:spacing w:after="36"/>
+      </w:pPr>
+      <w:r>
+        <w:rPr>
+          <w:rFonts w:ascii="Calibri" w:cs="Calibri" w:eastAsia="Calibri" w:hAnsi="Calibri"/>
+          <w:b/>
+          <w:bCs/>
+          <w:i w:val="false"/>
+          <w:iCs w:val="false"/>
+          <w:color w:val="24303F"/>
+          <w:sz w:val="19"/>
+          <w:szCs w:val="19"/>
+        </w:rPr>
+        <w:t xml:space="preserve">Real numbers in the first screen (guideline #5) </w:t>
+      </w:r>
+      <w:r>
+        <w:rPr>
+          <w:rFonts w:ascii="Calibri" w:cs="Calibri" w:eastAsia="Calibri" w:hAnsi="Calibri"/>
+          <w:b w:val="false"/>
+          <w:bCs w:val="false"/>
+          <w:i w:val="false"/>
+          <w:iCs w:val="false"/>
+          <w:color w:val="24303F"/>
+          <w:sz w:val="19"/>
+          <w:szCs w:val="19"/>
+        </w:rPr>
+        <w:t xml:space="preserve">— where the page touches margins or compliance, state the actual figures early: real reseller margin %, Trillet’s per-minute / plan pricing, and the named certifications (HIPAA, SOC 2) included at no extra cost. Not ‘competitive margins’ — the number.</w:t>
       </w:r>
     </w:p>
     <w:p>
@@ -1577,6 +1626,214 @@
                 <w:sz w:val="14"/>
                 <w:szCs w:val="14"/>
               </w:rPr>
+              <w:t xml:space="preserve">white-label pricing / plans</w:t>
+            </w:r>
+          </w:p>
+        </w:tc>
+        <w:tc>
+          <w:tcPr>
+            <w:tcW w:type="dxa" w:w="3160"/>
+            <w:tcBorders>
+              <w:top w:val="single" w:color="D9DEE8" w:sz="4"/>
+              <w:left w:val="single" w:color="D9DEE8" w:sz="4"/>
+              <w:bottom w:val="single" w:color="D9DEE8" w:sz="4"/>
+              <w:right w:val="single" w:color="D9DEE8" w:sz="4"/>
+            </w:tcBorders>
+            <w:shd w:fill="FFFFFF" w:color="auto" w:val="clear"/>
+            <w:tcMar>
+              <w:top w:type="dxa" w:w="55"/>
+              <w:left w:type="dxa" w:w="95"/>
+              <w:bottom w:type="dxa" w:w="55"/>
+              <w:right w:type="dxa" w:w="95"/>
+            </w:tcMar>
+          </w:tcPr>
+          <w:p>
+            <w:pPr>
+              <w:spacing w:after="0" w:line="248"/>
+            </w:pPr>
+            <w:r>
+              <w:rPr>
+                <w:rFonts w:ascii="Calibri" w:cs="Calibri" w:eastAsia="Calibri" w:hAnsi="Calibri"/>
+                <w:b w:val="false"/>
+                <w:bCs w:val="false"/>
+                <w:color w:val="24303F"/>
+                <w:sz w:val="14"/>
+                <w:szCs w:val="14"/>
+              </w:rPr>
+              <w:t xml:space="preserve">/whitelabel/pricing</w:t>
+            </w:r>
+          </w:p>
+        </w:tc>
+        <w:tc>
+          <w:tcPr>
+            <w:tcW w:type="dxa" w:w="1800"/>
+            <w:tcBorders>
+              <w:top w:val="single" w:color="D9DEE8" w:sz="4"/>
+              <w:left w:val="single" w:color="D9DEE8" w:sz="4"/>
+              <w:bottom w:val="single" w:color="D9DEE8" w:sz="4"/>
+              <w:right w:val="single" w:color="D9DEE8" w:sz="4"/>
+            </w:tcBorders>
+            <w:shd w:fill="FFFFFF" w:color="auto" w:val="clear"/>
+            <w:tcMar>
+              <w:top w:type="dxa" w:w="55"/>
+              <w:left w:type="dxa" w:w="95"/>
+              <w:bottom w:type="dxa" w:w="55"/>
+              <w:right w:type="dxa" w:w="95"/>
+            </w:tcMar>
+          </w:tcPr>
+          <w:p>
+            <w:pPr>
+              <w:spacing w:after="0" w:line="248"/>
+            </w:pPr>
+            <w:r>
+              <w:rPr>
+                <w:rFonts w:ascii="Calibri" w:cs="Calibri" w:eastAsia="Calibri" w:hAnsi="Calibri"/>
+                <w:b w:val="false"/>
+                <w:bCs w:val="false"/>
+                <w:color w:val="24303F"/>
+                <w:sz w:val="14"/>
+                <w:szCs w:val="14"/>
+              </w:rPr>
+              <w:t xml:space="preserve">Guideline #7 — money-flow &amp; getting-started</w:t>
+            </w:r>
+          </w:p>
+        </w:tc>
+      </w:tr>
+      <w:tr>
+        <w:tc>
+          <w:tcPr>
+            <w:tcW w:type="dxa" w:w="4400"/>
+            <w:tcBorders>
+              <w:top w:val="single" w:color="D9DEE8" w:sz="4"/>
+              <w:left w:val="single" w:color="D9DEE8" w:sz="4"/>
+              <w:bottom w:val="single" w:color="D9DEE8" w:sz="4"/>
+              <w:right w:val="single" w:color="D9DEE8" w:sz="4"/>
+            </w:tcBorders>
+            <w:shd w:fill="FFFFFF" w:color="auto" w:val="clear"/>
+            <w:tcMar>
+              <w:top w:type="dxa" w:w="55"/>
+              <w:left w:type="dxa" w:w="95"/>
+              <w:bottom w:type="dxa" w:w="55"/>
+              <w:right w:type="dxa" w:w="95"/>
+            </w:tcMar>
+          </w:tcPr>
+          <w:p>
+            <w:pPr>
+              <w:spacing w:after="0" w:line="248"/>
+            </w:pPr>
+            <w:r>
+              <w:rPr>
+                <w:rFonts w:ascii="Calibri" w:cs="Calibri" w:eastAsia="Calibri" w:hAnsi="Calibri"/>
+                <w:b w:val="false"/>
+                <w:bCs w:val="false"/>
+                <w:color w:val="24303F"/>
+                <w:sz w:val="14"/>
+                <w:szCs w:val="14"/>
+              </w:rPr>
+              <w:t xml:space="preserve">built-in compliance / auditable record</w:t>
+            </w:r>
+          </w:p>
+        </w:tc>
+        <w:tc>
+          <w:tcPr>
+            <w:tcW w:type="dxa" w:w="3160"/>
+            <w:tcBorders>
+              <w:top w:val="single" w:color="D9DEE8" w:sz="4"/>
+              <w:left w:val="single" w:color="D9DEE8" w:sz="4"/>
+              <w:bottom w:val="single" w:color="D9DEE8" w:sz="4"/>
+              <w:right w:val="single" w:color="D9DEE8" w:sz="4"/>
+            </w:tcBorders>
+            <w:shd w:fill="FFFFFF" w:color="auto" w:val="clear"/>
+            <w:tcMar>
+              <w:top w:type="dxa" w:w="55"/>
+              <w:left w:type="dxa" w:w="95"/>
+              <w:bottom w:type="dxa" w:w="55"/>
+              <w:right w:type="dxa" w:w="95"/>
+            </w:tcMar>
+          </w:tcPr>
+          <w:p>
+            <w:pPr>
+              <w:spacing w:after="0" w:line="248"/>
+            </w:pPr>
+            <w:r>
+              <w:rPr>
+                <w:rFonts w:ascii="Calibri" w:cs="Calibri" w:eastAsia="Calibri" w:hAnsi="Calibri"/>
+                <w:b w:val="false"/>
+                <w:bCs w:val="false"/>
+                <w:color w:val="24303F"/>
+                <w:sz w:val="14"/>
+                <w:szCs w:val="14"/>
+              </w:rPr>
+              <w:t xml:space="preserve">/blogs/white-label-ai-with-built-in-compliance</w:t>
+            </w:r>
+          </w:p>
+        </w:tc>
+        <w:tc>
+          <w:tcPr>
+            <w:tcW w:type="dxa" w:w="1800"/>
+            <w:tcBorders>
+              <w:top w:val="single" w:color="D9DEE8" w:sz="4"/>
+              <w:left w:val="single" w:color="D9DEE8" w:sz="4"/>
+              <w:bottom w:val="single" w:color="D9DEE8" w:sz="4"/>
+              <w:right w:val="single" w:color="D9DEE8" w:sz="4"/>
+            </w:tcBorders>
+            <w:shd w:fill="FFFFFF" w:color="auto" w:val="clear"/>
+            <w:tcMar>
+              <w:top w:type="dxa" w:w="55"/>
+              <w:left w:type="dxa" w:w="95"/>
+              <w:bottom w:type="dxa" w:w="55"/>
+              <w:right w:type="dxa" w:w="95"/>
+            </w:tcMar>
+          </w:tcPr>
+          <w:p>
+            <w:pPr>
+              <w:spacing w:after="0" w:line="248"/>
+            </w:pPr>
+            <w:r>
+              <w:rPr>
+                <w:rFonts w:ascii="Calibri" w:cs="Calibri" w:eastAsia="Calibri" w:hAnsi="Calibri"/>
+                <w:b w:val="false"/>
+                <w:bCs w:val="false"/>
+                <w:color w:val="24303F"/>
+                <w:sz w:val="14"/>
+                <w:szCs w:val="14"/>
+              </w:rPr>
+              <w:t xml:space="preserve">Guideline #7 — the compliance subsection</w:t>
+            </w:r>
+          </w:p>
+        </w:tc>
+      </w:tr>
+      <w:tr>
+        <w:tc>
+          <w:tcPr>
+            <w:tcW w:type="dxa" w:w="4400"/>
+            <w:tcBorders>
+              <w:top w:val="single" w:color="D9DEE8" w:sz="4"/>
+              <w:left w:val="single" w:color="D9DEE8" w:sz="4"/>
+              <w:bottom w:val="single" w:color="D9DEE8" w:sz="4"/>
+              <w:right w:val="single" w:color="D9DEE8" w:sz="4"/>
+            </w:tcBorders>
+            <w:shd w:fill="FFFFFF" w:color="auto" w:val="clear"/>
+            <w:tcMar>
+              <w:top w:type="dxa" w:w="55"/>
+              <w:left w:type="dxa" w:w="95"/>
+              <w:bottom w:type="dxa" w:w="55"/>
+              <w:right w:type="dxa" w:w="95"/>
+            </w:tcMar>
+          </w:tcPr>
+          <w:p>
+            <w:pPr>
+              <w:spacing w:after="0" w:line="248"/>
+            </w:pPr>
+            <w:r>
+              <w:rPr>
+                <w:rFonts w:ascii="Calibri" w:cs="Calibri" w:eastAsia="Calibri" w:hAnsi="Calibri"/>
+                <w:b w:val="false"/>
+                <w:bCs w:val="false"/>
+                <w:color w:val="24303F"/>
+                <w:sz w:val="14"/>
+                <w:szCs w:val="14"/>
+              </w:rPr>
               <w:t xml:space="preserve">white-label profit margins</w:t>
             </w:r>
           </w:p>
@@ -2285,6 +2542,1006 @@
           <w:szCs w:val="19"/>
         </w:rPr>
         <w:t xml:space="preserve">One primary CTA to /partners; don’t scatter competing CTAs.</w:t>
+      </w:r>
+    </w:p>
+    <w:p>
+      <w:pPr>
+        <w:pBdr>
+          <w:bottom w:val="single" w:color="D9DEE8" w:sz="6"/>
+        </w:pBdr>
+        <w:spacing w:after="110" w:before="110"/>
+      </w:pPr>
+      <w:r>
+        <w:t xml:space="preserve"/>
+      </w:r>
+    </w:p>
+    <w:p>
+      <w:pPr>
+        <w:spacing w:after="50" w:before="70"/>
+      </w:pPr>
+      <w:r>
+        <w:rPr>
+          <w:rFonts w:ascii="Georgia" w:cs="Georgia" w:eastAsia="Georgia" w:hAnsi="Georgia"/>
+          <w:b/>
+          <w:bCs/>
+          <w:color w:val="16223C"/>
+          <w:sz w:val="25"/>
+          <w:szCs w:val="25"/>
+        </w:rPr>
+        <w:t xml:space="preserve">Alignment with Trillet content guidelines (§1 checklist)</w:t>
+      </w:r>
+    </w:p>
+    <w:tbl>
+      <w:tblPr>
+        <w:tblW w:type="dxa" w:w="9360"/>
+        <w:tblBorders>
+          <w:top w:val="single" w:color="D9DEE8" w:sz="4"/>
+          <w:left w:val="single" w:color="D9DEE8" w:sz="4"/>
+          <w:bottom w:val="single" w:color="D9DEE8" w:sz="4"/>
+          <w:right w:val="single" w:color="D9DEE8" w:sz="4"/>
+          <w:insideH w:val="single" w:color="D9DEE8" w:sz="4"/>
+          <w:insideV w:val="single" w:color="D9DEE8" w:sz="4"/>
+        </w:tblBorders>
+      </w:tblPr>
+      <w:tblGrid>
+        <w:gridCol w:w="600"/>
+        <w:gridCol w:w="4560"/>
+        <w:gridCol w:w="4200"/>
+      </w:tblGrid>
+      <w:tr>
+        <w:trPr>
+          <w:tblHeader/>
+        </w:trPr>
+        <w:tc>
+          <w:tcPr>
+            <w:tcW w:type="dxa" w:w="600"/>
+            <w:tcBorders>
+              <w:top w:val="single" w:color="D9DEE8" w:sz="4"/>
+              <w:left w:val="single" w:color="D9DEE8" w:sz="4"/>
+              <w:bottom w:val="single" w:color="D9DEE8" w:sz="4"/>
+              <w:right w:val="single" w:color="D9DEE8" w:sz="4"/>
+            </w:tcBorders>
+            <w:shd w:fill="16223C" w:color="auto" w:val="clear"/>
+            <w:tcMar>
+              <w:top w:type="dxa" w:w="55"/>
+              <w:left w:type="dxa" w:w="95"/>
+              <w:bottom w:type="dxa" w:w="55"/>
+              <w:right w:type="dxa" w:w="95"/>
+            </w:tcMar>
+          </w:tcPr>
+          <w:p>
+            <w:pPr>
+              <w:spacing w:after="0" w:line="248"/>
+            </w:pPr>
+            <w:r>
+              <w:rPr>
+                <w:rFonts w:ascii="Calibri" w:cs="Calibri" w:eastAsia="Calibri" w:hAnsi="Calibri"/>
+                <w:b/>
+                <w:bCs/>
+                <w:color w:val="FFFFFF"/>
+                <w:sz w:val="15"/>
+                <w:szCs w:val="15"/>
+              </w:rPr>
+              <w:t xml:space="preserve">#</w:t>
+            </w:r>
+          </w:p>
+        </w:tc>
+        <w:tc>
+          <w:tcPr>
+            <w:tcW w:type="dxa" w:w="4560"/>
+            <w:tcBorders>
+              <w:top w:val="single" w:color="D9DEE8" w:sz="4"/>
+              <w:left w:val="single" w:color="D9DEE8" w:sz="4"/>
+              <w:bottom w:val="single" w:color="D9DEE8" w:sz="4"/>
+              <w:right w:val="single" w:color="D9DEE8" w:sz="4"/>
+            </w:tcBorders>
+            <w:shd w:fill="16223C" w:color="auto" w:val="clear"/>
+            <w:tcMar>
+              <w:top w:type="dxa" w:w="55"/>
+              <w:left w:type="dxa" w:w="95"/>
+              <w:bottom w:type="dxa" w:w="55"/>
+              <w:right w:type="dxa" w:w="95"/>
+            </w:tcMar>
+          </w:tcPr>
+          <w:p>
+            <w:pPr>
+              <w:spacing w:after="0" w:line="248"/>
+            </w:pPr>
+            <w:r>
+              <w:rPr>
+                <w:rFonts w:ascii="Calibri" w:cs="Calibri" w:eastAsia="Calibri" w:hAnsi="Calibri"/>
+                <w:b/>
+                <w:bCs/>
+                <w:color w:val="FFFFFF"/>
+                <w:sz w:val="15"/>
+                <w:szCs w:val="15"/>
+              </w:rPr>
+              <w:t xml:space="preserve">Guideline</w:t>
+            </w:r>
+          </w:p>
+        </w:tc>
+        <w:tc>
+          <w:tcPr>
+            <w:tcW w:type="dxa" w:w="4200"/>
+            <w:tcBorders>
+              <w:top w:val="single" w:color="D9DEE8" w:sz="4"/>
+              <w:left w:val="single" w:color="D9DEE8" w:sz="4"/>
+              <w:bottom w:val="single" w:color="D9DEE8" w:sz="4"/>
+              <w:right w:val="single" w:color="D9DEE8" w:sz="4"/>
+            </w:tcBorders>
+            <w:shd w:fill="16223C" w:color="auto" w:val="clear"/>
+            <w:tcMar>
+              <w:top w:type="dxa" w:w="55"/>
+              <w:left w:type="dxa" w:w="95"/>
+              <w:bottom w:type="dxa" w:w="55"/>
+              <w:right w:type="dxa" w:w="95"/>
+            </w:tcMar>
+          </w:tcPr>
+          <w:p>
+            <w:pPr>
+              <w:spacing w:after="0" w:line="248"/>
+            </w:pPr>
+            <w:r>
+              <w:rPr>
+                <w:rFonts w:ascii="Calibri" w:cs="Calibri" w:eastAsia="Calibri" w:hAnsi="Calibri"/>
+                <w:b/>
+                <w:bCs/>
+                <w:color w:val="FFFFFF"/>
+                <w:sz w:val="15"/>
+                <w:szCs w:val="15"/>
+              </w:rPr>
+              <w:t xml:space="preserve">How this brief meets it</w:t>
+            </w:r>
+          </w:p>
+        </w:tc>
+      </w:tr>
+      <w:tr>
+        <w:tc>
+          <w:tcPr>
+            <w:tcW w:type="dxa" w:w="600"/>
+            <w:tcBorders>
+              <w:top w:val="single" w:color="D9DEE8" w:sz="4"/>
+              <w:left w:val="single" w:color="D9DEE8" w:sz="4"/>
+              <w:bottom w:val="single" w:color="D9DEE8" w:sz="4"/>
+              <w:right w:val="single" w:color="D9DEE8" w:sz="4"/>
+            </w:tcBorders>
+            <w:shd w:fill="FFFFFF" w:color="auto" w:val="clear"/>
+            <w:tcMar>
+              <w:top w:type="dxa" w:w="55"/>
+              <w:left w:type="dxa" w:w="95"/>
+              <w:bottom w:type="dxa" w:w="55"/>
+              <w:right w:type="dxa" w:w="95"/>
+            </w:tcMar>
+          </w:tcPr>
+          <w:p>
+            <w:pPr>
+              <w:spacing w:after="0" w:line="248"/>
+            </w:pPr>
+            <w:r>
+              <w:rPr>
+                <w:rFonts w:ascii="Calibri" w:cs="Calibri" w:eastAsia="Calibri" w:hAnsi="Calibri"/>
+                <w:b w:val="false"/>
+                <w:bCs w:val="false"/>
+                <w:color w:val="24303F"/>
+                <w:sz w:val="14"/>
+                <w:szCs w:val="14"/>
+              </w:rPr>
+              <w:t xml:space="preserve">1</w:t>
+            </w:r>
+          </w:p>
+        </w:tc>
+        <w:tc>
+          <w:tcPr>
+            <w:tcW w:type="dxa" w:w="4560"/>
+            <w:tcBorders>
+              <w:top w:val="single" w:color="D9DEE8" w:sz="4"/>
+              <w:left w:val="single" w:color="D9DEE8" w:sz="4"/>
+              <w:bottom w:val="single" w:color="D9DEE8" w:sz="4"/>
+              <w:right w:val="single" w:color="D9DEE8" w:sz="4"/>
+            </w:tcBorders>
+            <w:shd w:fill="FFFFFF" w:color="auto" w:val="clear"/>
+            <w:tcMar>
+              <w:top w:type="dxa" w:w="55"/>
+              <w:left w:type="dxa" w:w="95"/>
+              <w:bottom w:type="dxa" w:w="55"/>
+              <w:right w:type="dxa" w:w="95"/>
+            </w:tcMar>
+          </w:tcPr>
+          <w:p>
+            <w:pPr>
+              <w:spacing w:after="0" w:line="248"/>
+            </w:pPr>
+            <w:r>
+              <w:rPr>
+                <w:rFonts w:ascii="Calibri" w:cs="Calibri" w:eastAsia="Calibri" w:hAnsi="Calibri"/>
+                <w:b w:val="false"/>
+                <w:bCs w:val="false"/>
+                <w:color w:val="24303F"/>
+                <w:sz w:val="14"/>
+                <w:szCs w:val="14"/>
+              </w:rPr>
+              <w:t xml:space="preserve">Open with the answer, not the pitch</w:t>
+            </w:r>
+          </w:p>
+        </w:tc>
+        <w:tc>
+          <w:tcPr>
+            <w:tcW w:type="dxa" w:w="4200"/>
+            <w:tcBorders>
+              <w:top w:val="single" w:color="D9DEE8" w:sz="4"/>
+              <w:left w:val="single" w:color="D9DEE8" w:sz="4"/>
+              <w:bottom w:val="single" w:color="D9DEE8" w:sz="4"/>
+              <w:right w:val="single" w:color="D9DEE8" w:sz="4"/>
+            </w:tcBorders>
+            <w:shd w:fill="FFFFFF" w:color="auto" w:val="clear"/>
+            <w:tcMar>
+              <w:top w:type="dxa" w:w="55"/>
+              <w:left w:type="dxa" w:w="95"/>
+              <w:bottom w:type="dxa" w:w="55"/>
+              <w:right w:type="dxa" w:w="95"/>
+            </w:tcMar>
+          </w:tcPr>
+          <w:p>
+            <w:pPr>
+              <w:spacing w:after="0" w:line="248"/>
+            </w:pPr>
+            <w:r>
+              <w:rPr>
+                <w:rFonts w:ascii="Calibri" w:cs="Calibri" w:eastAsia="Calibri" w:hAnsi="Calibri"/>
+                <w:b w:val="false"/>
+                <w:bCs w:val="false"/>
+                <w:color w:val="24303F"/>
+                <w:sz w:val="14"/>
+                <w:szCs w:val="14"/>
+              </w:rPr>
+              <w:t xml:space="preserve">Intro opens with the definition (the query’s answer); Trillet pitch deferred.</w:t>
+            </w:r>
+          </w:p>
+        </w:tc>
+      </w:tr>
+      <w:tr>
+        <w:tc>
+          <w:tcPr>
+            <w:tcW w:type="dxa" w:w="600"/>
+            <w:tcBorders>
+              <w:top w:val="single" w:color="D9DEE8" w:sz="4"/>
+              <w:left w:val="single" w:color="D9DEE8" w:sz="4"/>
+              <w:bottom w:val="single" w:color="D9DEE8" w:sz="4"/>
+              <w:right w:val="single" w:color="D9DEE8" w:sz="4"/>
+            </w:tcBorders>
+            <w:shd w:fill="FFFFFF" w:color="auto" w:val="clear"/>
+            <w:tcMar>
+              <w:top w:type="dxa" w:w="55"/>
+              <w:left w:type="dxa" w:w="95"/>
+              <w:bottom w:type="dxa" w:w="55"/>
+              <w:right w:type="dxa" w:w="95"/>
+            </w:tcMar>
+          </w:tcPr>
+          <w:p>
+            <w:pPr>
+              <w:spacing w:after="0" w:line="248"/>
+            </w:pPr>
+            <w:r>
+              <w:rPr>
+                <w:rFonts w:ascii="Calibri" w:cs="Calibri" w:eastAsia="Calibri" w:hAnsi="Calibri"/>
+                <w:b w:val="false"/>
+                <w:bCs w:val="false"/>
+                <w:color w:val="24303F"/>
+                <w:sz w:val="14"/>
+                <w:szCs w:val="14"/>
+              </w:rPr>
+              <w:t xml:space="preserve">2</w:t>
+            </w:r>
+          </w:p>
+        </w:tc>
+        <w:tc>
+          <w:tcPr>
+            <w:tcW w:type="dxa" w:w="4560"/>
+            <w:tcBorders>
+              <w:top w:val="single" w:color="D9DEE8" w:sz="4"/>
+              <w:left w:val="single" w:color="D9DEE8" w:sz="4"/>
+              <w:bottom w:val="single" w:color="D9DEE8" w:sz="4"/>
+              <w:right w:val="single" w:color="D9DEE8" w:sz="4"/>
+            </w:tcBorders>
+            <w:shd w:fill="FFFFFF" w:color="auto" w:val="clear"/>
+            <w:tcMar>
+              <w:top w:type="dxa" w:w="55"/>
+              <w:left w:type="dxa" w:w="95"/>
+              <w:bottom w:type="dxa" w:w="55"/>
+              <w:right w:type="dxa" w:w="95"/>
+            </w:tcMar>
+          </w:tcPr>
+          <w:p>
+            <w:pPr>
+              <w:spacing w:after="0" w:line="248"/>
+            </w:pPr>
+            <w:r>
+              <w:rPr>
+                <w:rFonts w:ascii="Calibri" w:cs="Calibri" w:eastAsia="Calibri" w:hAnsi="Calibri"/>
+                <w:b w:val="false"/>
+                <w:bCs w:val="false"/>
+                <w:color w:val="24303F"/>
+                <w:sz w:val="14"/>
+                <w:szCs w:val="14"/>
+              </w:rPr>
+              <w:t xml:space="preserve">Title = searcher’s phrase</w:t>
+            </w:r>
+          </w:p>
+        </w:tc>
+        <w:tc>
+          <w:tcPr>
+            <w:tcW w:type="dxa" w:w="4200"/>
+            <w:tcBorders>
+              <w:top w:val="single" w:color="D9DEE8" w:sz="4"/>
+              <w:left w:val="single" w:color="D9DEE8" w:sz="4"/>
+              <w:bottom w:val="single" w:color="D9DEE8" w:sz="4"/>
+              <w:right w:val="single" w:color="D9DEE8" w:sz="4"/>
+            </w:tcBorders>
+            <w:shd w:fill="FFFFFF" w:color="auto" w:val="clear"/>
+            <w:tcMar>
+              <w:top w:type="dxa" w:w="55"/>
+              <w:left w:type="dxa" w:w="95"/>
+              <w:bottom w:type="dxa" w:w="55"/>
+              <w:right w:type="dxa" w:w="95"/>
+            </w:tcMar>
+          </w:tcPr>
+          <w:p>
+            <w:pPr>
+              <w:spacing w:after="0" w:line="248"/>
+            </w:pPr>
+            <w:r>
+              <w:rPr>
+                <w:rFonts w:ascii="Calibri" w:cs="Calibri" w:eastAsia="Calibri" w:hAnsi="Calibri"/>
+                <w:b w:val="false"/>
+                <w:bCs w:val="false"/>
+                <w:color w:val="24303F"/>
+                <w:sz w:val="14"/>
+                <w:szCs w:val="14"/>
+              </w:rPr>
+              <w:t xml:space="preserve">Title leads with ‘White-Label Partnerships’, the exact term.</w:t>
+            </w:r>
+          </w:p>
+        </w:tc>
+      </w:tr>
+      <w:tr>
+        <w:tc>
+          <w:tcPr>
+            <w:tcW w:type="dxa" w:w="600"/>
+            <w:tcBorders>
+              <w:top w:val="single" w:color="D9DEE8" w:sz="4"/>
+              <w:left w:val="single" w:color="D9DEE8" w:sz="4"/>
+              <w:bottom w:val="single" w:color="D9DEE8" w:sz="4"/>
+              <w:right w:val="single" w:color="D9DEE8" w:sz="4"/>
+            </w:tcBorders>
+            <w:shd w:fill="FFFFFF" w:color="auto" w:val="clear"/>
+            <w:tcMar>
+              <w:top w:type="dxa" w:w="55"/>
+              <w:left w:type="dxa" w:w="95"/>
+              <w:bottom w:type="dxa" w:w="55"/>
+              <w:right w:type="dxa" w:w="95"/>
+            </w:tcMar>
+          </w:tcPr>
+          <w:p>
+            <w:pPr>
+              <w:spacing w:after="0" w:line="248"/>
+            </w:pPr>
+            <w:r>
+              <w:rPr>
+                <w:rFonts w:ascii="Calibri" w:cs="Calibri" w:eastAsia="Calibri" w:hAnsi="Calibri"/>
+                <w:b w:val="false"/>
+                <w:bCs w:val="false"/>
+                <w:color w:val="24303F"/>
+                <w:sz w:val="14"/>
+                <w:szCs w:val="14"/>
+              </w:rPr>
+              <w:t xml:space="preserve">3</w:t>
+            </w:r>
+          </w:p>
+        </w:tc>
+        <w:tc>
+          <w:tcPr>
+            <w:tcW w:type="dxa" w:w="4560"/>
+            <w:tcBorders>
+              <w:top w:val="single" w:color="D9DEE8" w:sz="4"/>
+              <w:left w:val="single" w:color="D9DEE8" w:sz="4"/>
+              <w:bottom w:val="single" w:color="D9DEE8" w:sz="4"/>
+              <w:right w:val="single" w:color="D9DEE8" w:sz="4"/>
+            </w:tcBorders>
+            <w:shd w:fill="FFFFFF" w:color="auto" w:val="clear"/>
+            <w:tcMar>
+              <w:top w:type="dxa" w:w="55"/>
+              <w:left w:type="dxa" w:w="95"/>
+              <w:bottom w:type="dxa" w:w="55"/>
+              <w:right w:type="dxa" w:w="95"/>
+            </w:tcMar>
+          </w:tcPr>
+          <w:p>
+            <w:pPr>
+              <w:spacing w:after="0" w:line="248"/>
+            </w:pPr>
+            <w:r>
+              <w:rPr>
+                <w:rFonts w:ascii="Calibri" w:cs="Calibri" w:eastAsia="Calibri" w:hAnsi="Calibri"/>
+                <w:b w:val="false"/>
+                <w:bCs w:val="false"/>
+                <w:color w:val="24303F"/>
+                <w:sz w:val="14"/>
+                <w:szCs w:val="14"/>
+              </w:rPr>
+              <w:t xml:space="preserve">One piece per intent</w:t>
+            </w:r>
+          </w:p>
+        </w:tc>
+        <w:tc>
+          <w:tcPr>
+            <w:tcW w:type="dxa" w:w="4200"/>
+            <w:tcBorders>
+              <w:top w:val="single" w:color="D9DEE8" w:sz="4"/>
+              <w:left w:val="single" w:color="D9DEE8" w:sz="4"/>
+              <w:bottom w:val="single" w:color="D9DEE8" w:sz="4"/>
+              <w:right w:val="single" w:color="D9DEE8" w:sz="4"/>
+            </w:tcBorders>
+            <w:shd w:fill="FFFFFF" w:color="auto" w:val="clear"/>
+            <w:tcMar>
+              <w:top w:type="dxa" w:w="55"/>
+              <w:left w:type="dxa" w:w="95"/>
+              <w:bottom w:type="dxa" w:w="55"/>
+              <w:right w:type="dxa" w:w="95"/>
+            </w:tcMar>
+          </w:tcPr>
+          <w:p>
+            <w:pPr>
+              <w:spacing w:after="0" w:line="248"/>
+            </w:pPr>
+            <w:r>
+              <w:rPr>
+                <w:rFonts w:ascii="Calibri" w:cs="Calibri" w:eastAsia="Calibri" w:hAnsi="Calibri"/>
+                <w:b w:val="false"/>
+                <w:bCs w:val="false"/>
+                <w:color w:val="24303F"/>
+                <w:sz w:val="14"/>
+                <w:szCs w:val="14"/>
+              </w:rPr>
+              <w:t xml:space="preserve">Net-new topic, distinct intent; reciprocal link to Blog 2 — no cannibalisation.</w:t>
+            </w:r>
+          </w:p>
+        </w:tc>
+      </w:tr>
+      <w:tr>
+        <w:tc>
+          <w:tcPr>
+            <w:tcW w:type="dxa" w:w="600"/>
+            <w:tcBorders>
+              <w:top w:val="single" w:color="D9DEE8" w:sz="4"/>
+              <w:left w:val="single" w:color="D9DEE8" w:sz="4"/>
+              <w:bottom w:val="single" w:color="D9DEE8" w:sz="4"/>
+              <w:right w:val="single" w:color="D9DEE8" w:sz="4"/>
+            </w:tcBorders>
+            <w:shd w:fill="FFFFFF" w:color="auto" w:val="clear"/>
+            <w:tcMar>
+              <w:top w:type="dxa" w:w="55"/>
+              <w:left w:type="dxa" w:w="95"/>
+              <w:bottom w:type="dxa" w:w="55"/>
+              <w:right w:type="dxa" w:w="95"/>
+            </w:tcMar>
+          </w:tcPr>
+          <w:p>
+            <w:pPr>
+              <w:spacing w:after="0" w:line="248"/>
+            </w:pPr>
+            <w:r>
+              <w:rPr>
+                <w:rFonts w:ascii="Calibri" w:cs="Calibri" w:eastAsia="Calibri" w:hAnsi="Calibri"/>
+                <w:b w:val="false"/>
+                <w:bCs w:val="false"/>
+                <w:color w:val="24303F"/>
+                <w:sz w:val="14"/>
+                <w:szCs w:val="14"/>
+              </w:rPr>
+              <w:t xml:space="preserve">4</w:t>
+            </w:r>
+          </w:p>
+        </w:tc>
+        <w:tc>
+          <w:tcPr>
+            <w:tcW w:type="dxa" w:w="4560"/>
+            <w:tcBorders>
+              <w:top w:val="single" w:color="D9DEE8" w:sz="4"/>
+              <w:left w:val="single" w:color="D9DEE8" w:sz="4"/>
+              <w:bottom w:val="single" w:color="D9DEE8" w:sz="4"/>
+              <w:right w:val="single" w:color="D9DEE8" w:sz="4"/>
+            </w:tcBorders>
+            <w:shd w:fill="FFFFFF" w:color="auto" w:val="clear"/>
+            <w:tcMar>
+              <w:top w:type="dxa" w:w="55"/>
+              <w:left w:type="dxa" w:w="95"/>
+              <w:bottom w:type="dxa" w:w="55"/>
+              <w:right w:type="dxa" w:w="95"/>
+            </w:tcMar>
+          </w:tcPr>
+          <w:p>
+            <w:pPr>
+              <w:spacing w:after="0" w:line="248"/>
+            </w:pPr>
+            <w:r>
+              <w:rPr>
+                <w:rFonts w:ascii="Calibri" w:cs="Calibri" w:eastAsia="Calibri" w:hAnsi="Calibri"/>
+                <w:b w:val="false"/>
+                <w:bCs w:val="false"/>
+                <w:color w:val="24303F"/>
+                <w:sz w:val="14"/>
+                <w:szCs w:val="14"/>
+              </w:rPr>
+              <w:t xml:space="preserve">Match specificity to competitiveness</w:t>
+            </w:r>
+          </w:p>
+        </w:tc>
+        <w:tc>
+          <w:tcPr>
+            <w:tcW w:type="dxa" w:w="4200"/>
+            <w:tcBorders>
+              <w:top w:val="single" w:color="D9DEE8" w:sz="4"/>
+              <w:left w:val="single" w:color="D9DEE8" w:sz="4"/>
+              <w:bottom w:val="single" w:color="D9DEE8" w:sz="4"/>
+              <w:right w:val="single" w:color="D9DEE8" w:sz="4"/>
+            </w:tcBorders>
+            <w:shd w:fill="FFFFFF" w:color="auto" w:val="clear"/>
+            <w:tcMar>
+              <w:top w:type="dxa" w:w="55"/>
+              <w:left w:type="dxa" w:w="95"/>
+              <w:bottom w:type="dxa" w:w="55"/>
+              <w:right w:type="dxa" w:w="95"/>
+            </w:tcMar>
+          </w:tcPr>
+          <w:p>
+            <w:pPr>
+              <w:spacing w:after="0" w:line="248"/>
+            </w:pPr>
+            <w:r>
+              <w:rPr>
+                <w:rFonts w:ascii="Calibri" w:cs="Calibri" w:eastAsia="Calibri" w:hAnsi="Calibri"/>
+                <w:b w:val="false"/>
+                <w:bCs w:val="false"/>
+                <w:color w:val="24303F"/>
+                <w:sz w:val="14"/>
+                <w:szCs w:val="14"/>
+              </w:rPr>
+              <w:t xml:space="preserve">Mid-tier winnable term, not an over-contested head term.</w:t>
+            </w:r>
+          </w:p>
+        </w:tc>
+      </w:tr>
+      <w:tr>
+        <w:tc>
+          <w:tcPr>
+            <w:tcW w:type="dxa" w:w="600"/>
+            <w:tcBorders>
+              <w:top w:val="single" w:color="D9DEE8" w:sz="4"/>
+              <w:left w:val="single" w:color="D9DEE8" w:sz="4"/>
+              <w:bottom w:val="single" w:color="D9DEE8" w:sz="4"/>
+              <w:right w:val="single" w:color="D9DEE8" w:sz="4"/>
+            </w:tcBorders>
+            <w:shd w:fill="FFFFFF" w:color="auto" w:val="clear"/>
+            <w:tcMar>
+              <w:top w:type="dxa" w:w="55"/>
+              <w:left w:type="dxa" w:w="95"/>
+              <w:bottom w:type="dxa" w:w="55"/>
+              <w:right w:type="dxa" w:w="95"/>
+            </w:tcMar>
+          </w:tcPr>
+          <w:p>
+            <w:pPr>
+              <w:spacing w:after="0" w:line="248"/>
+            </w:pPr>
+            <w:r>
+              <w:rPr>
+                <w:rFonts w:ascii="Calibri" w:cs="Calibri" w:eastAsia="Calibri" w:hAnsi="Calibri"/>
+                <w:b w:val="false"/>
+                <w:bCs w:val="false"/>
+                <w:color w:val="24303F"/>
+                <w:sz w:val="14"/>
+                <w:szCs w:val="14"/>
+              </w:rPr>
+              <w:t xml:space="preserve">5</w:t>
+            </w:r>
+          </w:p>
+        </w:tc>
+        <w:tc>
+          <w:tcPr>
+            <w:tcW w:type="dxa" w:w="4560"/>
+            <w:tcBorders>
+              <w:top w:val="single" w:color="D9DEE8" w:sz="4"/>
+              <w:left w:val="single" w:color="D9DEE8" w:sz="4"/>
+              <w:bottom w:val="single" w:color="D9DEE8" w:sz="4"/>
+              <w:right w:val="single" w:color="D9DEE8" w:sz="4"/>
+            </w:tcBorders>
+            <w:shd w:fill="FFFFFF" w:color="auto" w:val="clear"/>
+            <w:tcMar>
+              <w:top w:type="dxa" w:w="55"/>
+              <w:left w:type="dxa" w:w="95"/>
+              <w:bottom w:type="dxa" w:w="55"/>
+              <w:right w:type="dxa" w:w="95"/>
+            </w:tcMar>
+          </w:tcPr>
+          <w:p>
+            <w:pPr>
+              <w:spacing w:after="0" w:line="248"/>
+            </w:pPr>
+            <w:r>
+              <w:rPr>
+                <w:rFonts w:ascii="Calibri" w:cs="Calibri" w:eastAsia="Calibri" w:hAnsi="Calibri"/>
+                <w:b w:val="false"/>
+                <w:bCs w:val="false"/>
+                <w:color w:val="24303F"/>
+                <w:sz w:val="14"/>
+                <w:szCs w:val="14"/>
+              </w:rPr>
+              <w:t xml:space="preserve">Number/certs in first screen</w:t>
+            </w:r>
+          </w:p>
+        </w:tc>
+        <w:tc>
+          <w:tcPr>
+            <w:tcW w:type="dxa" w:w="4200"/>
+            <w:tcBorders>
+              <w:top w:val="single" w:color="D9DEE8" w:sz="4"/>
+              <w:left w:val="single" w:color="D9DEE8" w:sz="4"/>
+              <w:bottom w:val="single" w:color="D9DEE8" w:sz="4"/>
+              <w:right w:val="single" w:color="D9DEE8" w:sz="4"/>
+            </w:tcBorders>
+            <w:shd w:fill="FFFFFF" w:color="auto" w:val="clear"/>
+            <w:tcMar>
+              <w:top w:type="dxa" w:w="55"/>
+              <w:left w:type="dxa" w:w="95"/>
+              <w:bottom w:type="dxa" w:w="55"/>
+              <w:right w:type="dxa" w:w="95"/>
+            </w:tcMar>
+          </w:tcPr>
+          <w:p>
+            <w:pPr>
+              <w:spacing w:after="0" w:line="248"/>
+            </w:pPr>
+            <w:r>
+              <w:rPr>
+                <w:rFonts w:ascii="Calibri" w:cs="Calibri" w:eastAsia="Calibri" w:hAnsi="Calibri"/>
+                <w:b w:val="false"/>
+                <w:bCs w:val="false"/>
+                <w:color w:val="24303F"/>
+                <w:sz w:val="14"/>
+                <w:szCs w:val="14"/>
+              </w:rPr>
+              <w:t xml:space="preserve">Must-include: real margin %, pricing and named certs stated early.</w:t>
+            </w:r>
+          </w:p>
+        </w:tc>
+      </w:tr>
+      <w:tr>
+        <w:tc>
+          <w:tcPr>
+            <w:tcW w:type="dxa" w:w="600"/>
+            <w:tcBorders>
+              <w:top w:val="single" w:color="D9DEE8" w:sz="4"/>
+              <w:left w:val="single" w:color="D9DEE8" w:sz="4"/>
+              <w:bottom w:val="single" w:color="D9DEE8" w:sz="4"/>
+              <w:right w:val="single" w:color="D9DEE8" w:sz="4"/>
+            </w:tcBorders>
+            <w:shd w:fill="FFFFFF" w:color="auto" w:val="clear"/>
+            <w:tcMar>
+              <w:top w:type="dxa" w:w="55"/>
+              <w:left w:type="dxa" w:w="95"/>
+              <w:bottom w:type="dxa" w:w="55"/>
+              <w:right w:type="dxa" w:w="95"/>
+            </w:tcMar>
+          </w:tcPr>
+          <w:p>
+            <w:pPr>
+              <w:spacing w:after="0" w:line="248"/>
+            </w:pPr>
+            <w:r>
+              <w:rPr>
+                <w:rFonts w:ascii="Calibri" w:cs="Calibri" w:eastAsia="Calibri" w:hAnsi="Calibri"/>
+                <w:b w:val="false"/>
+                <w:bCs w:val="false"/>
+                <w:color w:val="24303F"/>
+                <w:sz w:val="14"/>
+                <w:szCs w:val="14"/>
+              </w:rPr>
+              <w:t xml:space="preserve">6</w:t>
+            </w:r>
+          </w:p>
+        </w:tc>
+        <w:tc>
+          <w:tcPr>
+            <w:tcW w:type="dxa" w:w="4560"/>
+            <w:tcBorders>
+              <w:top w:val="single" w:color="D9DEE8" w:sz="4"/>
+              <w:left w:val="single" w:color="D9DEE8" w:sz="4"/>
+              <w:bottom w:val="single" w:color="D9DEE8" w:sz="4"/>
+              <w:right w:val="single" w:color="D9DEE8" w:sz="4"/>
+            </w:tcBorders>
+            <w:shd w:fill="FFFFFF" w:color="auto" w:val="clear"/>
+            <w:tcMar>
+              <w:top w:type="dxa" w:w="55"/>
+              <w:left w:type="dxa" w:w="95"/>
+              <w:bottom w:type="dxa" w:w="55"/>
+              <w:right w:type="dxa" w:w="95"/>
+            </w:tcMar>
+          </w:tcPr>
+          <w:p>
+            <w:pPr>
+              <w:spacing w:after="0" w:line="248"/>
+            </w:pPr>
+            <w:r>
+              <w:rPr>
+                <w:rFonts w:ascii="Calibri" w:cs="Calibri" w:eastAsia="Calibri" w:hAnsi="Calibri"/>
+                <w:b w:val="false"/>
+                <w:bCs w:val="false"/>
+                <w:color w:val="24303F"/>
+                <w:sz w:val="14"/>
+                <w:szCs w:val="14"/>
+              </w:rPr>
+              <w:t xml:space="preserve">FAQPage schema</w:t>
+            </w:r>
+          </w:p>
+        </w:tc>
+        <w:tc>
+          <w:tcPr>
+            <w:tcW w:type="dxa" w:w="4200"/>
+            <w:tcBorders>
+              <w:top w:val="single" w:color="D9DEE8" w:sz="4"/>
+              <w:left w:val="single" w:color="D9DEE8" w:sz="4"/>
+              <w:bottom w:val="single" w:color="D9DEE8" w:sz="4"/>
+              <w:right w:val="single" w:color="D9DEE8" w:sz="4"/>
+            </w:tcBorders>
+            <w:shd w:fill="FFFFFF" w:color="auto" w:val="clear"/>
+            <w:tcMar>
+              <w:top w:type="dxa" w:w="55"/>
+              <w:left w:type="dxa" w:w="95"/>
+              <w:bottom w:type="dxa" w:w="55"/>
+              <w:right w:type="dxa" w:w="95"/>
+            </w:tcMar>
+          </w:tcPr>
+          <w:p>
+            <w:pPr>
+              <w:spacing w:after="0" w:line="248"/>
+            </w:pPr>
+            <w:r>
+              <w:rPr>
+                <w:rFonts w:ascii="Calibri" w:cs="Calibri" w:eastAsia="Calibri" w:hAnsi="Calibri"/>
+                <w:b w:val="false"/>
+                <w:bCs w:val="false"/>
+                <w:color w:val="24303F"/>
+                <w:sz w:val="14"/>
+                <w:szCs w:val="14"/>
+              </w:rPr>
+              <w:t xml:space="preserve">FAQ block + FAQPage schema specified.</w:t>
+            </w:r>
+          </w:p>
+        </w:tc>
+      </w:tr>
+      <w:tr>
+        <w:tc>
+          <w:tcPr>
+            <w:tcW w:type="dxa" w:w="600"/>
+            <w:tcBorders>
+              <w:top w:val="single" w:color="D9DEE8" w:sz="4"/>
+              <w:left w:val="single" w:color="D9DEE8" w:sz="4"/>
+              <w:bottom w:val="single" w:color="D9DEE8" w:sz="4"/>
+              <w:right w:val="single" w:color="D9DEE8" w:sz="4"/>
+            </w:tcBorders>
+            <w:shd w:fill="FFFFFF" w:color="auto" w:val="clear"/>
+            <w:tcMar>
+              <w:top w:type="dxa" w:w="55"/>
+              <w:left w:type="dxa" w:w="95"/>
+              <w:bottom w:type="dxa" w:w="55"/>
+              <w:right w:type="dxa" w:w="95"/>
+            </w:tcMar>
+          </w:tcPr>
+          <w:p>
+            <w:pPr>
+              <w:spacing w:after="0" w:line="248"/>
+            </w:pPr>
+            <w:r>
+              <w:rPr>
+                <w:rFonts w:ascii="Calibri" w:cs="Calibri" w:eastAsia="Calibri" w:hAnsi="Calibri"/>
+                <w:b w:val="false"/>
+                <w:bCs w:val="false"/>
+                <w:color w:val="24303F"/>
+                <w:sz w:val="14"/>
+                <w:szCs w:val="14"/>
+              </w:rPr>
+              <w:t xml:space="preserve">7</w:t>
+            </w:r>
+          </w:p>
+        </w:tc>
+        <w:tc>
+          <w:tcPr>
+            <w:tcW w:type="dxa" w:w="4560"/>
+            <w:tcBorders>
+              <w:top w:val="single" w:color="D9DEE8" w:sz="4"/>
+              <w:left w:val="single" w:color="D9DEE8" w:sz="4"/>
+              <w:bottom w:val="single" w:color="D9DEE8" w:sz="4"/>
+              <w:right w:val="single" w:color="D9DEE8" w:sz="4"/>
+            </w:tcBorders>
+            <w:shd w:fill="FFFFFF" w:color="auto" w:val="clear"/>
+            <w:tcMar>
+              <w:top w:type="dxa" w:w="55"/>
+              <w:left w:type="dxa" w:w="95"/>
+              <w:bottom w:type="dxa" w:w="55"/>
+              <w:right w:type="dxa" w:w="95"/>
+            </w:tcMar>
+          </w:tcPr>
+          <w:p>
+            <w:pPr>
+              <w:spacing w:after="0" w:line="248"/>
+            </w:pPr>
+            <w:r>
+              <w:rPr>
+                <w:rFonts w:ascii="Calibri" w:cs="Calibri" w:eastAsia="Calibri" w:hAnsi="Calibri"/>
+                <w:b w:val="false"/>
+                <w:bCs w:val="false"/>
+                <w:color w:val="24303F"/>
+                <w:sz w:val="14"/>
+                <w:szCs w:val="14"/>
+              </w:rPr>
+              <w:t xml:space="preserve">Link to /pricing + canonical compliance</w:t>
+            </w:r>
+          </w:p>
+        </w:tc>
+        <w:tc>
+          <w:tcPr>
+            <w:tcW w:type="dxa" w:w="4200"/>
+            <w:tcBorders>
+              <w:top w:val="single" w:color="D9DEE8" w:sz="4"/>
+              <w:left w:val="single" w:color="D9DEE8" w:sz="4"/>
+              <w:bottom w:val="single" w:color="D9DEE8" w:sz="4"/>
+              <w:right w:val="single" w:color="D9DEE8" w:sz="4"/>
+            </w:tcBorders>
+            <w:shd w:fill="FFFFFF" w:color="auto" w:val="clear"/>
+            <w:tcMar>
+              <w:top w:type="dxa" w:w="55"/>
+              <w:left w:type="dxa" w:w="95"/>
+              <w:bottom w:type="dxa" w:w="55"/>
+              <w:right w:type="dxa" w:w="95"/>
+            </w:tcMar>
+          </w:tcPr>
+          <w:p>
+            <w:pPr>
+              <w:spacing w:after="0" w:line="248"/>
+            </w:pPr>
+            <w:r>
+              <w:rPr>
+                <w:rFonts w:ascii="Calibri" w:cs="Calibri" w:eastAsia="Calibri" w:hAnsi="Calibri"/>
+                <w:b w:val="false"/>
+                <w:bCs w:val="false"/>
+                <w:color w:val="24303F"/>
+                <w:sz w:val="14"/>
+                <w:szCs w:val="14"/>
+              </w:rPr>
+              <w:t xml:space="preserve">Links to /whitelabel/pricing and /blogs/white-label-ai-with-built-in-compliance.</w:t>
+            </w:r>
+          </w:p>
+        </w:tc>
+      </w:tr>
+      <w:tr>
+        <w:tc>
+          <w:tcPr>
+            <w:tcW w:type="dxa" w:w="600"/>
+            <w:tcBorders>
+              <w:top w:val="single" w:color="D9DEE8" w:sz="4"/>
+              <w:left w:val="single" w:color="D9DEE8" w:sz="4"/>
+              <w:bottom w:val="single" w:color="D9DEE8" w:sz="4"/>
+              <w:right w:val="single" w:color="D9DEE8" w:sz="4"/>
+            </w:tcBorders>
+            <w:shd w:fill="FFFFFF" w:color="auto" w:val="clear"/>
+            <w:tcMar>
+              <w:top w:type="dxa" w:w="55"/>
+              <w:left w:type="dxa" w:w="95"/>
+              <w:bottom w:type="dxa" w:w="55"/>
+              <w:right w:type="dxa" w:w="95"/>
+            </w:tcMar>
+          </w:tcPr>
+          <w:p>
+            <w:pPr>
+              <w:spacing w:after="0" w:line="248"/>
+            </w:pPr>
+            <w:r>
+              <w:rPr>
+                <w:rFonts w:ascii="Calibri" w:cs="Calibri" w:eastAsia="Calibri" w:hAnsi="Calibri"/>
+                <w:b w:val="false"/>
+                <w:bCs w:val="false"/>
+                <w:color w:val="24303F"/>
+                <w:sz w:val="14"/>
+                <w:szCs w:val="14"/>
+              </w:rPr>
+              <w:t xml:space="preserve">8</w:t>
+            </w:r>
+          </w:p>
+        </w:tc>
+        <w:tc>
+          <w:tcPr>
+            <w:tcW w:type="dxa" w:w="4560"/>
+            <w:tcBorders>
+              <w:top w:val="single" w:color="D9DEE8" w:sz="4"/>
+              <w:left w:val="single" w:color="D9DEE8" w:sz="4"/>
+              <w:bottom w:val="single" w:color="D9DEE8" w:sz="4"/>
+              <w:right w:val="single" w:color="D9DEE8" w:sz="4"/>
+            </w:tcBorders>
+            <w:shd w:fill="FFFFFF" w:color="auto" w:val="clear"/>
+            <w:tcMar>
+              <w:top w:type="dxa" w:w="55"/>
+              <w:left w:type="dxa" w:w="95"/>
+              <w:bottom w:type="dxa" w:w="55"/>
+              <w:right w:type="dxa" w:w="95"/>
+            </w:tcMar>
+          </w:tcPr>
+          <w:p>
+            <w:pPr>
+              <w:spacing w:after="0" w:line="248"/>
+            </w:pPr>
+            <w:r>
+              <w:rPr>
+                <w:rFonts w:ascii="Calibri" w:cs="Calibri" w:eastAsia="Calibri" w:hAnsi="Calibri"/>
+                <w:b w:val="false"/>
+                <w:bCs w:val="false"/>
+                <w:color w:val="24303F"/>
+                <w:sz w:val="14"/>
+                <w:szCs w:val="14"/>
+              </w:rPr>
+              <w:t xml:space="preserve">Consolidate before expanding</w:t>
+            </w:r>
+          </w:p>
+        </w:tc>
+        <w:tc>
+          <w:tcPr>
+            <w:tcW w:type="dxa" w:w="4200"/>
+            <w:tcBorders>
+              <w:top w:val="single" w:color="D9DEE8" w:sz="4"/>
+              <w:left w:val="single" w:color="D9DEE8" w:sz="4"/>
+              <w:bottom w:val="single" w:color="D9DEE8" w:sz="4"/>
+              <w:right w:val="single" w:color="D9DEE8" w:sz="4"/>
+            </w:tcBorders>
+            <w:shd w:fill="FFFFFF" w:color="auto" w:val="clear"/>
+            <w:tcMar>
+              <w:top w:type="dxa" w:w="55"/>
+              <w:left w:type="dxa" w:w="95"/>
+              <w:bottom w:type="dxa" w:w="55"/>
+              <w:right w:type="dxa" w:w="95"/>
+            </w:tcMar>
+          </w:tcPr>
+          <w:p>
+            <w:pPr>
+              <w:spacing w:after="0" w:line="248"/>
+            </w:pPr>
+            <w:r>
+              <w:rPr>
+                <w:rFonts w:ascii="Calibri" w:cs="Calibri" w:eastAsia="Calibri" w:hAnsi="Calibri"/>
+                <w:b w:val="false"/>
+                <w:bCs w:val="false"/>
+                <w:color w:val="24303F"/>
+                <w:sz w:val="14"/>
+                <w:szCs w:val="14"/>
+              </w:rPr>
+              <w:t xml:space="preserve">Justified exception: genuine gap (zero existing coverage), not a thin duplicate; consolidation runs first in the sprint.</w:t>
+            </w:r>
+          </w:p>
+        </w:tc>
+      </w:tr>
+    </w:tbl>
+    <w:p>
+      <w:pPr>
+        <w:spacing w:after="80"/>
+      </w:pPr>
+      <w:r>
+        <w:rPr>
+          <w:rFonts w:ascii="Calibri" w:cs="Calibri" w:eastAsia="Calibri" w:hAnsi="Calibri"/>
+          <w:i/>
+          <w:iCs/>
+          <w:color w:val="5A6675"/>
+          <w:sz w:val="20"/>
+          <w:szCs w:val="20"/>
+        </w:rPr>
+        <w:t xml:space="preserve">Keyword note: this is a net-new topic with no Trillet GSC history, so the target keywords are inferred from the competitor SERP, not validated against Trillet’s own demand data. Validate volume before committing heavy effort.</w:t>
       </w:r>
     </w:p>
     <w:p>

</xml_diff>